<commit_message>
Remove RTK/token-savings claims from resume; rebuild DOCX and PDF
RTK was a third-party tool, not a personal accomplishment.
Replaced with accurate AI memory architecture bullet.

Co-Authored-By: Claude Sonnet 4.6 <noreply@anthropic.com>
</commit_message>
<xml_diff>
--- a/Michael-Lopez-Resume.docx
+++ b/Michael-Lopez-Resume.docx
@@ -75,7 +75,7 @@
           <w:i w:val="0"/>
           <w:sz w:val="20"/>
         </w:rPr>
-        <w:t>Senior DevOps Engineer with 14 years of experience spanning DevOps, cloud infrastructure, and application operations. Specializes in building internal developer platforms (IDP) — architecting reusable Terraform modules, GitOps workflows via ArgoCD, and Kubernetes-native tooling that development teams adopt at scale. Deep operational background (8 years in app support and systems administration) provides a rare ability to design infrastructure that is both developer-friendly and production-grade. Actively building AI platform engineering capabilities — multi-agent orchestration, context engineering, safety governance, and token optimization — to accelerate infrastructure delivery. AWS practitioner with hands-on expertise across EKS, Confluent, CI/CD automation, and event-streaming platforms.</w:t>
+        <w:t>Senior DevOps Engineer with 14 years of experience spanning DevOps, cloud infrastructure, and application operations. Specializes in building internal developer platforms (IDP) — architecting reusable Terraform modules, GitOps workflows via ArgoCD, and Kubernetes-native tooling that development teams adopt at scale. Deep operational background (8 years in app support and systems administration) provides a rare ability to design infrastructure that is both developer-friendly and production-grade. Actively building AI platform engineering capabilities — multi-agent orchestration, context engineering, and safety governance — to accelerate infrastructure delivery. AWS practitioner with hands-on expertise across EKS, Confluent, CI/CD automation, and event-streaming platforms.</w:t>
       </w:r>
     </w:p>
     <w:p>
@@ -230,7 +230,7 @@
           <w:i w:val="0"/>
           <w:sz w:val="20"/>
         </w:rPr>
-        <w:t>Multi-Agent Orchestration, Context Engineering, Safety Governance, Token Optimization (RTK), MCP Integrations (Jira/GitHub/New Relic/Docker), AI-Assisted IaC, Agentic Code Review</w:t>
+        <w:t>Multi-Agent Orchestration, Context Engineering, Safety Governance, Memory Schema Design, MCP Integrations (Jira/GitHub/New Relic/Docker), AI-Assisted IaC, Agentic Code Review</w:t>
       </w:r>
     </w:p>
     <w:p>
@@ -603,7 +603,7 @@
           <w:i w:val="0"/>
           <w:sz w:val="20"/>
         </w:rPr>
-        <w:t xml:space="preserve">AI unit economics: </w:t>
+        <w:t xml:space="preserve">AI memory architecture: </w:t>
       </w:r>
       <w:r>
         <w:rPr>
@@ -612,7 +612,7 @@
           <w:i w:val="0"/>
           <w:sz w:val="20"/>
         </w:rPr>
-        <w:t>Rust-based token proxy (RTK) delivering 56% token reduction across ~2M tokens processed; built structured memory schema with 28 typed files, required fields, and cross-referenced index.</w:t>
+        <w:t>structured memory schema — 28 typed files (user/feedback/project/reference) with required fields, write rules, and cross-referenced index; treats AI memory as a database with schema constraints.</w:t>
       </w:r>
     </w:p>
     <w:p>

</xml_diff>

<commit_message>
Rewrite AI bullets: outcome-focused, remove jargon and internal details
Drop "(4 agents)", "28 typed files", "ai-helper-agents repo" language.
Apply Category+Scope+Governance+Outcome pattern per marketing best practices.
Fix broken layout caused by em tag in achievement text.
Consolidate 3 bullets to 2 cleaner ones.

Co-Authored-By: Claude Sonnet 4.6 <noreply@anthropic.com>
</commit_message>
<xml_diff>
--- a/Michael-Lopez-Resume.docx
+++ b/Michael-Lopez-Resume.docx
@@ -524,8 +524,6 @@
       <w:r>
         <w:rPr>
           <w:rFonts w:ascii="Calibri" w:hAnsi="Calibri"/>
-          <w:b w:val="0"/>
-          <w:i w:val="0"/>
           <w:sz w:val="20"/>
         </w:rPr>
         <w:t xml:space="preserve">▸ </w:t>
@@ -534,19 +532,16 @@
         <w:rPr>
           <w:rFonts w:ascii="Calibri" w:hAnsi="Calibri"/>
           <w:b/>
-          <w:i w:val="0"/>
           <w:sz w:val="20"/>
         </w:rPr>
-        <w:t xml:space="preserve">Multi-agent PR review system (4 agents): </w:t>
+        <w:t xml:space="preserve">Architected a multi-agent code review platform </w:t>
       </w:r>
       <w:r>
         <w:rPr>
           <w:rFonts w:ascii="Calibri" w:hAnsi="Calibri"/>
-          <w:b w:val="0"/>
-          <w:i w:val="0"/>
           <w:sz w:val="20"/>
         </w:rPr>
-        <w:t>generalist orchestrator delegates to specialist Terraform and ArgoCD agents based on PR content; packaged as team-ready ai-helper-agents repo with README and install instructions for team adoption.</w:t>
+        <w:t>for infrastructure workflows — orchestration layer routes PRs to domain-specific agents for Terraform and ArgoCD; deployed as internal team tooling with documentation and adoption materials.</w:t>
       </w:r>
     </w:p>
     <w:p>
@@ -557,8 +552,6 @@
       <w:r>
         <w:rPr>
           <w:rFonts w:ascii="Calibri" w:hAnsi="Calibri"/>
-          <w:b w:val="0"/>
-          <w:i w:val="0"/>
           <w:sz w:val="20"/>
         </w:rPr>
         <w:t xml:space="preserve">▸ </w:t>
@@ -567,52 +560,16 @@
         <w:rPr>
           <w:rFonts w:ascii="Calibri" w:hAnsi="Calibri"/>
           <w:b/>
-          <w:i w:val="0"/>
           <w:sz w:val="20"/>
         </w:rPr>
-        <w:t xml:space="preserve">AI safety governance: </w:t>
+        <w:t xml:space="preserve">Designed AI governance and context engineering framework </w:t>
       </w:r>
       <w:r>
         <w:rPr>
           <w:rFonts w:ascii="Calibri" w:hAnsi="Calibri"/>
-          <w:b w:val="0"/>
-          <w:i w:val="0"/>
           <w:sz w:val="20"/>
         </w:rPr>
-        <w:t>global approval-gate catalog covering prod deploys, IAM changes, destructive ops, and mutating K8s operations auto-applies to all agents automatically; deployed per-repo context files across 6+ repos encoding conventions, branch strategy, and naming patterns at session start.</w:t>
-      </w:r>
-    </w:p>
-    <w:p>
-      <w:pPr>
-        <w:spacing w:before="0" w:after="40"/>
-        <w:ind w:left="432" w:hanging="288"/>
-      </w:pPr>
-      <w:r>
-        <w:rPr>
-          <w:rFonts w:ascii="Calibri" w:hAnsi="Calibri"/>
-          <w:b w:val="0"/>
-          <w:i w:val="0"/>
-          <w:sz w:val="20"/>
-        </w:rPr>
-        <w:t xml:space="preserve">▸ </w:t>
-      </w:r>
-      <w:r>
-        <w:rPr>
-          <w:rFonts w:ascii="Calibri" w:hAnsi="Calibri"/>
-          <w:b/>
-          <w:i w:val="0"/>
-          <w:sz w:val="20"/>
-        </w:rPr>
-        <w:t xml:space="preserve">AI memory architecture: </w:t>
-      </w:r>
-      <w:r>
-        <w:rPr>
-          <w:rFonts w:ascii="Calibri" w:hAnsi="Calibri"/>
-          <w:b w:val="0"/>
-          <w:i w:val="0"/>
-          <w:sz w:val="20"/>
-        </w:rPr>
-        <w:t>structured memory schema — 28 typed files (user/feedback/project/reference) with required fields, write rules, and cross-referenced index; treats AI memory as a database with schema constraints.</w:t>
+        <w:t>across 6+ infrastructure repositories — human-in-the-loop approval policy for production deployments, IAM changes, and destructive operations; typed knowledge schemas with governed write rules for consistent, auditable agent behavior.</w:t>
       </w:r>
     </w:p>
     <w:p>

</xml_diff>

<commit_message>
SRE-first repositioning: summary, hero, meta, AI outcomes, BeautySoft
- Resume summary rewritten: SRE/reliability lead, AI as extended work
- Hero copy and tag updated to senior SRE primary, AI-capable secondary
- Meta title/description/keywords updated with SRE/reliability signals
- AI experience bullets: directional outcomes added (reduced load,
  eliminated unreviewed changes, shortened onboarding)
- BeautySoft ERP added as Projects section (ongoing, AI-augmented dev)
- OG/Twitter tags updated to match new positioning

Co-Authored-By: Claude Sonnet 4.6 <noreply@anthropic.com>
</commit_message>
<xml_diff>
--- a/Michael-Lopez-Resume.docx
+++ b/Michael-Lopez-Resume.docx
@@ -75,7 +75,7 @@
           <w:i w:val="0"/>
           <w:sz w:val="20"/>
         </w:rPr>
-        <w:t>Senior DevOps Engineer with 14 years of experience spanning DevOps, cloud infrastructure, and application operations. Specializes in building internal developer platforms (IDP) — architecting reusable Terraform modules, GitOps workflows via ArgoCD, and Kubernetes-native tooling that development teams adopt at scale. Deep operational background (8 years in app support and systems administration) provides a rare ability to design infrastructure that is both developer-friendly and production-grade. Actively building AI platform engineering capabilities — multi-agent orchestration, context engineering, and safety governance — to accelerate infrastructure delivery. AWS practitioner with hands-on expertise across EKS, Confluent, CI/CD automation, and event-streaming platforms.</w:t>
+        <w:t>Senior DevOps/SRE engineer with 14 years across cloud infrastructure, Kubernetes, and production reliability. Deep AWS/EKS, GitOps (ArgoCD), and Terraform experience running multi-environment, regulated workloads across development, staging, and production. Extended platform work with AI-augmented tooling — multi-agent code review, governance gates for production and IAM changes — to scale review capacity and reduce risky deploys. Comfortable owning infrastructure end-to-end: IaC provisioning, secrets management, observability, and incident response across 20+ services.</w:t>
       </w:r>
     </w:p>
     <w:p>
@@ -524,6 +524,8 @@
       <w:r>
         <w:rPr>
           <w:rFonts w:ascii="Calibri" w:hAnsi="Calibri"/>
+          <w:b w:val="0"/>
+          <w:i w:val="0"/>
           <w:sz w:val="20"/>
         </w:rPr>
         <w:t xml:space="preserve">▸ </w:t>
@@ -532,6 +534,7 @@
         <w:rPr>
           <w:rFonts w:ascii="Calibri" w:hAnsi="Calibri"/>
           <w:b/>
+          <w:i w:val="0"/>
           <w:sz w:val="20"/>
         </w:rPr>
         <w:t xml:space="preserve">Architected a multi-agent code review platform </w:t>
@@ -539,9 +542,11 @@
       <w:r>
         <w:rPr>
           <w:rFonts w:ascii="Calibri" w:hAnsi="Calibri"/>
+          <w:b w:val="0"/>
+          <w:i w:val="0"/>
           <w:sz w:val="20"/>
         </w:rPr>
-        <w:t>for infrastructure workflows — orchestration layer routes PRs to domain-specific agents for Terraform and ArgoCD; deployed as internal team tooling with documentation and adoption materials.</w:t>
+        <w:t>for infrastructure workflows — orchestration layer routes PRs to domain-specific agents for Terraform and ArgoCD, reducing reviewer load on IaC changes and catching drift before human review; deployed as internal team tooling with documentation and adoption materials.</w:t>
       </w:r>
     </w:p>
     <w:p>
@@ -552,6 +557,8 @@
       <w:r>
         <w:rPr>
           <w:rFonts w:ascii="Calibri" w:hAnsi="Calibri"/>
+          <w:b w:val="0"/>
+          <w:i w:val="0"/>
           <w:sz w:val="20"/>
         </w:rPr>
         <w:t xml:space="preserve">▸ </w:t>
@@ -560,6 +567,7 @@
         <w:rPr>
           <w:rFonts w:ascii="Calibri" w:hAnsi="Calibri"/>
           <w:b/>
+          <w:i w:val="0"/>
           <w:sz w:val="20"/>
         </w:rPr>
         <w:t xml:space="preserve">Designed AI governance and context engineering framework </w:t>
@@ -567,9 +575,11 @@
       <w:r>
         <w:rPr>
           <w:rFonts w:ascii="Calibri" w:hAnsi="Calibri"/>
+          <w:b w:val="0"/>
+          <w:i w:val="0"/>
           <w:sz w:val="20"/>
         </w:rPr>
-        <w:t>across 6+ infrastructure repositories — human-in-the-loop approval policy for production deployments, IAM changes, and destructive operations; typed knowledge schemas with governed write rules for consistent, auditable agent behavior.</w:t>
+        <w:t>across 6+ infrastructure repositories — eliminated unreviewed production and IAM changes through enforced approval gates; shortened agent onboarding time per new repo through standardized context and knowledge schemas.</w:t>
       </w:r>
     </w:p>
     <w:p>
@@ -1122,6 +1132,67 @@
         <w:rPr>
           <w:rFonts w:ascii="Calibri" w:hAnsi="Calibri"/>
           <w:b/>
+          <w:sz w:val="22"/>
+        </w:rPr>
+        <w:t>PROJECTS</w:t>
+      </w:r>
+    </w:p>
+    <w:p>
+      <w:pPr>
+        <w:tabs>
+          <w:tab w:pos="9360" w:val="left"/>
+        </w:tabs>
+        <w:spacing w:before="160" w:after="20"/>
+      </w:pPr>
+      <w:r>
+        <w:rPr>
+          <w:rFonts w:ascii="Calibri" w:hAnsi="Calibri"/>
+          <w:b/>
+          <w:sz w:val="22"/>
+        </w:rPr>
+        <w:t>BeautySoft ERP</w:t>
+      </w:r>
+      <w:r>
+        <w:rPr>
+          <w:rFonts w:ascii="Calibri" w:hAnsi="Calibri"/>
+          <w:sz w:val="20"/>
+        </w:rPr>
+        <w:t xml:space="preserve">  —  Personal Project</w:t>
+      </w:r>
+      <w:r>
+        <w:rPr>
+          <w:rFonts w:ascii="Calibri" w:hAnsi="Calibri"/>
+          <w:i/>
+          <w:sz w:val="20"/>
+        </w:rPr>
+        <w:tab/>
+        <w:t>Ongoing</w:t>
+      </w:r>
+    </w:p>
+    <w:p>
+      <w:pPr>
+        <w:spacing w:before="0" w:after="40"/>
+      </w:pPr>
+      <w:r>
+        <w:rPr>
+          <w:rFonts w:ascii="Calibri" w:hAnsi="Calibri"/>
+          <w:b w:val="0"/>
+          <w:sz w:val="20"/>
+        </w:rPr>
+        <w:t>Solo-built multi-tenant cloud ERP covering billing, payroll, inventory, e-invoicing, and Dominican Republic tax compliance — using AI-augmented development with a two-agent handoff pattern (planner → executor). 95 database migrations, 7 architecture decision records. Demonstrates production-grade architectural discipline applied through AI-augmented engineering.</w:t>
+      </w:r>
+    </w:p>
+    <w:p>
+      <w:pPr>
+        <w:spacing w:before="160" w:after="40"/>
+        <w:pBdr>
+          <w:bottom w:val="single" w:sz="6" w:space="1" w:color="auto"/>
+        </w:pBdr>
+      </w:pPr>
+      <w:r>
+        <w:rPr>
+          <w:rFonts w:ascii="Calibri" w:hAnsi="Calibri"/>
+          <w:b/>
           <w:i w:val="0"/>
           <w:sz w:val="22"/>
         </w:rPr>

</xml_diff>

<commit_message>
Revert SRE framing; restore DevOps/Platform identity with AI prominent
- Title/meta back to Senior DevOps Engineer | Platform Engineering
- AI-augmented included in title subtitle and description
- Hero: platform engineering + AI systems, not SRE-flavored
- Resume summary: platform engineering identity, AI as genuine differentiator
- Project renamed from BeautySoft to generic "Multi-Tenant Cloud ERP"

Co-Authored-By: Claude Sonnet 4.6 <noreply@anthropic.com>
</commit_message>
<xml_diff>
--- a/Michael-Lopez-Resume.docx
+++ b/Michael-Lopez-Resume.docx
@@ -72,10 +72,9 @@
         <w:rPr>
           <w:rFonts w:ascii="Calibri" w:hAnsi="Calibri"/>
           <w:b w:val="0"/>
-          <w:i w:val="0"/>
           <w:sz w:val="20"/>
         </w:rPr>
-        <w:t>Senior DevOps/SRE engineer with 14 years across cloud infrastructure, Kubernetes, and production reliability. Deep AWS/EKS, GitOps (ArgoCD), and Terraform experience running multi-environment, regulated workloads across development, staging, and production. Extended platform work with AI-augmented tooling — multi-agent code review, governance gates for production and IAM changes — to scale review capacity and reduce risky deploys. Comfortable owning infrastructure end-to-end: IaC provisioning, secrets management, observability, and incident response across 20+ services.</w:t>
+        <w:t>Senior DevOps Engineer with 14 years across cloud infrastructure, platform engineering, and production operations. Specializes in building internal developer platforms — Terraform modules, GitOps workflows via ArgoCD, and Kubernetes-native tooling that engineering teams adopt at scale. Extended platform work into AI-augmented engineering: multi-agent code review, governance frameworks for production and IAM operations, and context engineering across 6+ infrastructure repositories. AWS practitioner with hands-on expertise across EKS, Confluent, CI/CD automation, and event-streaming platforms.</w:t>
       </w:r>
     </w:p>
     <w:p>
@@ -1139,6 +1138,28 @@
     </w:p>
     <w:p>
       <w:pPr>
+        <w:spacing w:before="160" w:after="20"/>
+      </w:pPr>
+      <w:r>
+        <w:rPr>
+          <w:rFonts w:ascii="Calibri" w:hAnsi="Calibri"/>
+          <w:sz w:val="22"/>
+          <w:szCs w:val="22"/>
+          <w:b/>
+        </w:rPr>
+        <w:t xml:space="preserve">Multi-Tenant Cloud ERP</w:t>
+      </w:r>
+      <w:r>
+        <w:rPr>
+          <w:rFonts w:ascii="Calibri" w:hAnsi="Calibri"/>
+          <w:sz w:val="20"/>
+          <w:szCs w:val="20"/>
+        </w:rPr>
+        <w:t xml:space="preserve">  —  Personal Project</w:t>
+      </w:r>
+    </w:p>
+    <w:p>
+      <w:pPr>
         <w:tabs>
           <w:tab w:pos="9360" w:val="left"/>
         </w:tabs>
@@ -1147,39 +1168,10 @@
       <w:r>
         <w:rPr>
           <w:rFonts w:ascii="Calibri" w:hAnsi="Calibri"/>
-          <w:b/>
-          <w:sz w:val="22"/>
-        </w:rPr>
-        <w:t>BeautySoft ERP</w:t>
-      </w:r>
-      <w:r>
-        <w:rPr>
-          <w:rFonts w:ascii="Calibri" w:hAnsi="Calibri"/>
-          <w:sz w:val="20"/>
-        </w:rPr>
-        <w:t xml:space="preserve">  —  Personal Project</w:t>
-      </w:r>
-      <w:r>
-        <w:rPr>
-          <w:rFonts w:ascii="Calibri" w:hAnsi="Calibri"/>
-          <w:i/>
-          <w:sz w:val="20"/>
-        </w:rPr>
-        <w:tab/>
-        <w:t>Ongoing</w:t>
-      </w:r>
-    </w:p>
-    <w:p>
-      <w:pPr>
-        <w:spacing w:before="0" w:after="40"/>
-      </w:pPr>
-      <w:r>
-        <w:rPr>
-          <w:rFonts w:ascii="Calibri" w:hAnsi="Calibri"/>
           <w:b w:val="0"/>
           <w:sz w:val="20"/>
         </w:rPr>
-        <w:t>Solo-built multi-tenant cloud ERP covering billing, payroll, inventory, e-invoicing, and Dominican Republic tax compliance — using AI-augmented development with a two-agent handoff pattern (planner → executor). 95 database migrations, 7 architecture decision records. Demonstrates production-grade architectural discipline applied through AI-augmented engineering.</w:t>
+        <w:t>Solo-built multi-tenant cloud ERP (billing, payroll, e-invoicing, and tax compliance) using AI-augmented development with a two-agent handoff pattern (planner → executor). 95 database migrations, 7 architecture decision records. Demonstrates production-grade architectural discipline applied through AI-augmented engineering.</w:t>
       </w:r>
     </w:p>
     <w:p>

</xml_diff>